<commit_message>
Revise calculator report cover, contents and numbering; separate timer assets
</commit_message>
<xml_diff>
--- a/master_class_1/variant_1/report/Отчет_МК1_вариант_1.docx
+++ b/master_class_1/variant_1/report/Отчет_МК1_вариант_1.docx
@@ -2,79 +2,287 @@
 <file path=word/document.xml><?xml version="1.0" encoding="utf-8"?>
 <w:document xmlns:wpc="http://schemas.microsoft.com/office/word/2010/wordprocessingCanvas" xmlns:mo="http://schemas.microsoft.com/office/mac/office/2008/main" xmlns:mc="http://schemas.openxmlformats.org/markup-compatibility/2006" xmlns:mv="urn:schemas-microsoft-com:mac:vml" xmlns:o="urn:schemas-microsoft-com:office:office" xmlns:r="http://schemas.openxmlformats.org/officeDocument/2006/relationships" xmlns:m="http://schemas.openxmlformats.org/officeDocument/2006/math" xmlns:v="urn:schemas-microsoft-com:vml" xmlns:wp14="http://schemas.microsoft.com/office/word/2010/wordprocessingDrawing" xmlns:wp="http://schemas.openxmlformats.org/drawingml/2006/wordprocessingDrawing" xmlns:w10="urn:schemas-microsoft-com:office:word" xmlns:w="http://schemas.openxmlformats.org/wordprocessingml/2006/main" xmlns:w14="http://schemas.microsoft.com/office/word/2010/wordml" xmlns:wpg="http://schemas.microsoft.com/office/word/2010/wordprocessingGroup" xmlns:wpi="http://schemas.microsoft.com/office/word/2010/wordprocessingInk" xmlns:wne="http://schemas.microsoft.com/office/word/2006/wordml" xmlns:wps="http://schemas.microsoft.com/office/word/2010/wordprocessingShape" mc:Ignorable="w14 wp14">
   <w:body>
-    <w:p/>
-    <w:p/>
-    <w:p/>
     <w:p>
       <w:pPr>
+        <w:spacing w:after="600" w:line="240" w:lineRule="auto"/>
         <w:jc w:val="center"/>
       </w:pPr>
       <w:r>
-        <w:t>Встроенные системы</w:t>
+        <w:drawing>
+          <wp:inline xmlns:a="http://schemas.openxmlformats.org/drawingml/2006/main" xmlns:pic="http://schemas.openxmlformats.org/drawingml/2006/picture">
+            <wp:extent cx="1181404" cy="457200"/>
+            <wp:docPr id="1" name="Picture 1"/>
+            <wp:cNvGraphicFramePr>
+              <a:graphicFrameLocks noChangeAspect="1"/>
+            </wp:cNvGraphicFramePr>
+            <a:graphic>
+              <a:graphicData uri="http://schemas.openxmlformats.org/drawingml/2006/picture">
+                <pic:pic>
+                  <pic:nvPicPr>
+                    <pic:cNvPr id="0" name="title-logo-0.jpg"/>
+                    <pic:cNvPicPr/>
+                  </pic:nvPicPr>
+                  <pic:blipFill>
+                    <a:blip r:embed="rId10"/>
+                    <a:stretch>
+                      <a:fillRect/>
+                    </a:stretch>
+                  </pic:blipFill>
+                  <pic:spPr>
+                    <a:xfrm>
+                      <a:off x="0" y="0"/>
+                      <a:ext cx="1181404" cy="457200"/>
+                    </a:xfrm>
+                    <a:prstGeom prst="rect"/>
+                  </pic:spPr>
+                </pic:pic>
+              </a:graphicData>
+            </a:graphic>
+          </wp:inline>
+        </w:drawing>
+      </w:r>
+    </w:p>
+    <w:p>
+      <w:pPr>
+        <w:spacing w:before="0" w:after="700" w:line="240" w:lineRule="auto"/>
+        <w:jc w:val="center"/>
+      </w:pPr>
+      <w:r>
+        <w:rPr>
+          <w:rFonts w:ascii="Times New Roman" w:hAnsi="Times New Roman"/>
+          <w:b w:val="0"/>
+          <w:sz w:val="28"/>
+        </w:rPr>
+        <w:t>ВСТРОЕННЫЕ СИСТЕМЫ</w:t>
       </w:r>
     </w:p>
     <w:p>
       <w:pPr>
         <w:pStyle w:val="Title"/>
+        <w:spacing w:before="0" w:after="500" w:line="240" w:lineRule="auto"/>
         <w:jc w:val="center"/>
       </w:pPr>
       <w:r>
-        <w:t>Отчет по мастер классу 1</w:t>
+        <w:rPr>
+          <w:rFonts w:ascii="Times New Roman" w:hAnsi="Times New Roman"/>
+          <w:b w:val="0"/>
+          <w:sz w:val="40"/>
+        </w:rPr>
+        <w:t>ОТЧЕТ</w:t>
       </w:r>
     </w:p>
     <w:p>
       <w:pPr>
+        <w:spacing w:before="0" w:after="460" w:line="240" w:lineRule="auto"/>
         <w:jc w:val="center"/>
       </w:pPr>
       <w:r>
+        <w:rPr>
+          <w:rFonts w:ascii="Times New Roman" w:hAnsi="Times New Roman"/>
+          <w:b w:val="0"/>
+          <w:sz w:val="36"/>
+        </w:rPr>
+        <w:t>по мастер-классу № 1</w:t>
+      </w:r>
+    </w:p>
+    <w:p>
+      <w:pPr>
+        <w:spacing w:before="0" w:after="80" w:line="240" w:lineRule="auto"/>
+        <w:jc w:val="center"/>
+      </w:pPr>
+      <w:r>
+        <w:rPr>
+          <w:rFonts w:ascii="Times New Roman" w:hAnsi="Times New Roman"/>
+          <w:b/>
+          <w:sz w:val="36"/>
+        </w:rPr>
         <w:t>Язык С во встроенных системах</w:t>
       </w:r>
     </w:p>
     <w:p>
       <w:pPr>
+        <w:spacing w:before="0" w:after="800" w:line="240" w:lineRule="auto"/>
         <w:jc w:val="center"/>
       </w:pPr>
       <w:r>
-        <w:t>Таймер и калькулятор</w:t>
+        <w:rPr>
+          <w:rFonts w:ascii="Times New Roman" w:hAnsi="Times New Roman"/>
+          <w:b/>
+          <w:sz w:val="36"/>
+        </w:rPr>
+        <w:t>Калькулятор</w:t>
       </w:r>
     </w:p>
     <w:p>
       <w:pPr>
+        <w:spacing w:before="0" w:after="440" w:line="240" w:lineRule="auto"/>
         <w:jc w:val="center"/>
       </w:pPr>
       <w:r>
-        <w:t>Вариант 1 и задание для получения варианта</w:t>
+        <w:rPr>
+          <w:rFonts w:ascii="Times New Roman" w:hAnsi="Times New Roman"/>
+          <w:b w:val="0"/>
+          <w:sz w:val="36"/>
+        </w:rPr>
+        <w:t xml:space="preserve">Группа </w:t>
       </w:r>
-    </w:p>
-    <w:p/>
-    <w:p/>
-    <w:p/>
-    <w:p/>
-    <w:p>
       <w:r>
-        <w:t>Исполнитель: Муравенко Григорий Павлович</w:t>
+        <w:rPr>
+          <w:rFonts w:ascii="Times New Roman" w:hAnsi="Times New Roman"/>
+          <w:b/>
+          <w:i/>
+          <w:sz w:val="36"/>
+        </w:rPr>
+        <w:t>P3330</w:t>
       </w:r>
     </w:p>
     <w:p>
+      <w:pPr>
+        <w:spacing w:before="0" w:after="1300" w:line="240" w:lineRule="auto"/>
+        <w:jc w:val="center"/>
+      </w:pPr>
       <w:r>
-        <w:t>Группа: P3330</w:t>
+        <w:rPr>
+          <w:rFonts w:ascii="Times New Roman" w:hAnsi="Times New Roman"/>
+          <w:b w:val="0"/>
+          <w:sz w:val="36"/>
+        </w:rPr>
+        <w:t xml:space="preserve">Вариант </w:t>
+      </w:r>
+      <w:r>
+        <w:rPr>
+          <w:rFonts w:ascii="Times New Roman" w:hAnsi="Times New Roman"/>
+          <w:b/>
+          <w:i/>
+          <w:sz w:val="36"/>
+        </w:rPr>
+        <w:t>1</w:t>
       </w:r>
     </w:p>
     <w:p>
+      <w:pPr>
+        <w:spacing w:before="0" w:after="400" w:line="240" w:lineRule="auto"/>
+        <w:jc w:val="left"/>
+      </w:pPr>
       <w:r>
-        <w:t>Преподаватель: Быковский Сергей Вячеславович</w:t>
+        <w:rPr>
+          <w:rFonts w:ascii="Times New Roman" w:hAnsi="Times New Roman"/>
+          <w:b w:val="0"/>
+          <w:sz w:val="36"/>
+        </w:rPr>
+        <w:t xml:space="preserve">Выполнил: </w:t>
+      </w:r>
+      <w:r>
+        <w:rPr>
+          <w:rFonts w:ascii="Times New Roman" w:hAnsi="Times New Roman"/>
+          <w:b/>
+          <w:i/>
+          <w:sz w:val="36"/>
+        </w:rPr>
+        <w:t>Муравенко Григорий Павлович</w:t>
       </w:r>
     </w:p>
-    <w:p/>
-    <w:p/>
-    <w:p/>
-    <w:p/>
     <w:p>
       <w:pPr>
+        <w:spacing w:before="0" w:after="400" w:line="240" w:lineRule="auto"/>
+        <w:jc w:val="left"/>
+      </w:pPr>
+      <w:r>
+        <w:rPr>
+          <w:rFonts w:ascii="Times New Roman" w:hAnsi="Times New Roman"/>
+          <w:b w:val="0"/>
+          <w:sz w:val="36"/>
+        </w:rPr>
+        <w:t xml:space="preserve">Преподаватель: </w:t>
+      </w:r>
+      <w:r>
+        <w:rPr>
+          <w:rFonts w:ascii="Times New Roman" w:hAnsi="Times New Roman"/>
+          <w:b/>
+          <w:i w:val="0"/>
+          <w:sz w:val="36"/>
+        </w:rPr>
+        <w:t>Быковский Сергей Вячеславович</w:t>
+      </w:r>
+    </w:p>
+    <w:p>
+      <w:pPr>
+        <w:spacing w:before="0" w:after="400" w:line="240" w:lineRule="auto"/>
+        <w:jc w:val="left"/>
+      </w:pPr>
+      <w:r>
+        <w:rPr>
+          <w:rFonts w:ascii="Times New Roman" w:hAnsi="Times New Roman"/>
+          <w:b w:val="0"/>
+          <w:sz w:val="36"/>
+        </w:rPr>
+        <w:t xml:space="preserve">Дата сдачи отчета: </w:t>
+      </w:r>
+      <w:r>
+        <w:rPr>
+          <w:rFonts w:ascii="Times New Roman" w:hAnsi="Times New Roman"/>
+          <w:b w:val="0"/>
+          <w:i w:val="0"/>
+          <w:sz w:val="36"/>
+        </w:rPr>
+      </w:r>
+    </w:p>
+    <w:p>
+      <w:pPr>
+        <w:spacing w:before="0" w:after="560" w:line="240" w:lineRule="auto"/>
+        <w:jc w:val="left"/>
+      </w:pPr>
+      <w:r>
+        <w:rPr>
+          <w:rFonts w:ascii="Times New Roman" w:hAnsi="Times New Roman"/>
+          <w:b w:val="0"/>
+          <w:sz w:val="36"/>
+        </w:rPr>
+        <w:t xml:space="preserve">Дата защиты: </w:t>
+      </w:r>
+      <w:r>
+        <w:rPr>
+          <w:rFonts w:ascii="Times New Roman" w:hAnsi="Times New Roman"/>
+          <w:b w:val="0"/>
+          <w:i w:val="0"/>
+          <w:sz w:val="36"/>
+        </w:rPr>
+      </w:r>
+    </w:p>
+    <w:p>
+      <w:pPr>
+        <w:spacing w:before="0" w:after="840" w:line="240" w:lineRule="auto"/>
+        <w:jc w:val="left"/>
+      </w:pPr>
+      <w:r>
+        <w:rPr>
+          <w:rFonts w:ascii="Times New Roman" w:hAnsi="Times New Roman"/>
+          <w:b w:val="0"/>
+          <w:sz w:val="36"/>
+        </w:rPr>
+        <w:t xml:space="preserve">Количество баллов: </w:t>
+      </w:r>
+      <w:r>
+        <w:rPr>
+          <w:rFonts w:ascii="Times New Roman" w:hAnsi="Times New Roman"/>
+          <w:b w:val="0"/>
+          <w:i w:val="0"/>
+          <w:sz w:val="36"/>
+        </w:rPr>
+      </w:r>
+    </w:p>
+    <w:p>
+      <w:pPr>
+        <w:spacing w:before="0" w:after="0" w:line="240" w:lineRule="auto"/>
         <w:jc w:val="center"/>
       </w:pPr>
       <w:r>
-        <w:t>2026</w:t>
+        <w:rPr>
+          <w:rFonts w:ascii="Times New Roman" w:hAnsi="Times New Roman"/>
+          <w:b w:val="0"/>
+          <w:sz w:val="36"/>
+        </w:rPr>
+        <w:t>СПб – 2026</w:t>
       </w:r>
     </w:p>
     <w:p>
@@ -87,8 +295,251 @@
         <w:pStyle w:val="Heading1"/>
       </w:pPr>
       <w:r>
-        <w:t>2 Цель и задачи работы</w:t>
+        <w:t>Оглавление</w:t>
       </w:r>
+    </w:p>
+    <w:p>
+      <w:pPr>
+        <w:tabs>
+          <w:tab w:pos="9638" w:val="right" w:leader="dot"/>
+        </w:tabs>
+        <w:spacing w:after="240"/>
+      </w:pPr>
+      <w:hyperlink w:anchor="goals">
+        <w:r>
+          <w:t>1 Цель и задачи работы</w:t>
+        </w:r>
+      </w:hyperlink>
+      <w:r>
+        <w:tab/>
+        <w:t>3</w:t>
+      </w:r>
+    </w:p>
+    <w:p>
+      <w:pPr>
+        <w:tabs>
+          <w:tab w:pos="9638" w:val="right" w:leader="dot"/>
+        </w:tabs>
+        <w:spacing w:after="240"/>
+        <w:ind w:left="283"/>
+      </w:pPr>
+      <w:hyperlink w:anchor="equipment">
+        <w:r>
+          <w:t>1.1 Используемое оборудование</w:t>
+        </w:r>
+      </w:hyperlink>
+      <w:r>
+        <w:tab/>
+        <w:t>3</w:t>
+      </w:r>
+    </w:p>
+    <w:p>
+      <w:pPr>
+        <w:tabs>
+          <w:tab w:pos="9638" w:val="right" w:leader="dot"/>
+        </w:tabs>
+        <w:spacing w:after="240"/>
+      </w:pPr>
+      <w:hyperlink w:anchor="sequence">
+        <w:r>
+          <w:t>2 Схема взаимодействия процессора и периферии</w:t>
+        </w:r>
+      </w:hyperlink>
+      <w:r>
+        <w:tab/>
+        <w:t>4</w:t>
+      </w:r>
+    </w:p>
+    <w:p>
+      <w:pPr>
+        <w:tabs>
+          <w:tab w:pos="9638" w:val="right" w:leader="dot"/>
+        </w:tabs>
+        <w:spacing w:after="240"/>
+      </w:pPr>
+      <w:hyperlink w:anchor="processes">
+        <w:r>
+          <w:t>3 Описание процессов на диаграмме</w:t>
+        </w:r>
+      </w:hyperlink>
+      <w:r>
+        <w:tab/>
+        <w:t>5</w:t>
+      </w:r>
+    </w:p>
+    <w:p>
+      <w:pPr>
+        <w:tabs>
+          <w:tab w:pos="9638" w:val="right" w:leader="dot"/>
+        </w:tabs>
+        <w:spacing w:after="240"/>
+        <w:ind w:left="283"/>
+      </w:pPr>
+      <w:hyperlink w:anchor="init">
+        <w:r>
+          <w:t>3.1 Инициализация и основной цикл</w:t>
+        </w:r>
+      </w:hyperlink>
+      <w:r>
+        <w:tab/>
+        <w:t>5</w:t>
+      </w:r>
+    </w:p>
+    <w:p>
+      <w:pPr>
+        <w:tabs>
+          <w:tab w:pos="9638" w:val="right" w:leader="dot"/>
+        </w:tabs>
+        <w:spacing w:after="240"/>
+        <w:ind w:left="283"/>
+      </w:pPr>
+      <w:hyperlink w:anchor="input">
+        <w:r>
+          <w:t>3.2 Обработка ввода</w:t>
+        </w:r>
+      </w:hyperlink>
+      <w:r>
+        <w:tab/>
+        <w:t>5</w:t>
+      </w:r>
+    </w:p>
+    <w:p>
+      <w:pPr>
+        <w:tabs>
+          <w:tab w:pos="9638" w:val="right" w:leader="dot"/>
+        </w:tabs>
+        <w:spacing w:after="240"/>
+        <w:ind w:left="283"/>
+      </w:pPr>
+      <w:hyperlink w:anchor="result">
+        <w:r>
+          <w:t>3.3 Вычисление и отображение результата</w:t>
+        </w:r>
+      </w:hyperlink>
+      <w:r>
+        <w:tab/>
+        <w:t>5</w:t>
+      </w:r>
+    </w:p>
+    <w:p>
+      <w:pPr>
+        <w:tabs>
+          <w:tab w:pos="9638" w:val="right" w:leader="dot"/>
+        </w:tabs>
+        <w:spacing w:after="240"/>
+      </w:pPr>
+      <w:hyperlink w:anchor="manual">
+        <w:r>
+          <w:t>4 Руководство пользователя</w:t>
+        </w:r>
+      </w:hyperlink>
+      <w:r>
+        <w:tab/>
+        <w:t>6</w:t>
+      </w:r>
+    </w:p>
+    <w:p>
+      <w:pPr>
+        <w:tabs>
+          <w:tab w:pos="9638" w:val="right" w:leader="dot"/>
+        </w:tabs>
+        <w:spacing w:after="240"/>
+        <w:ind w:left="283"/>
+      </w:pPr>
+      <w:hyperlink w:anchor="start">
+        <w:r>
+          <w:t>4.1 Запуск проекта</w:t>
+        </w:r>
+      </w:hyperlink>
+      <w:r>
+        <w:tab/>
+        <w:t>6</w:t>
+      </w:r>
+    </w:p>
+    <w:p>
+      <w:pPr>
+        <w:tabs>
+          <w:tab w:pos="9638" w:val="right" w:leader="dot"/>
+        </w:tabs>
+        <w:spacing w:after="240"/>
+        <w:ind w:left="283"/>
+      </w:pPr>
+      <w:hyperlink w:anchor="usage">
+        <w:r>
+          <w:t>4.2 Ввод выражения и получение результата</w:t>
+        </w:r>
+      </w:hyperlink>
+      <w:r>
+        <w:tab/>
+        <w:t>6</w:t>
+      </w:r>
+    </w:p>
+    <w:p>
+      <w:pPr>
+        <w:tabs>
+          <w:tab w:pos="9638" w:val="right" w:leader="dot"/>
+        </w:tabs>
+        <w:spacing w:after="240"/>
+        <w:ind w:left="283"/>
+      </w:pPr>
+      <w:hyperlink w:anchor="checks">
+        <w:r>
+          <w:t>4.3 Проверка основных функций</w:t>
+        </w:r>
+      </w:hyperlink>
+      <w:r>
+        <w:tab/>
+        <w:t>7</w:t>
+      </w:r>
+    </w:p>
+    <w:p>
+      <w:pPr>
+        <w:tabs>
+          <w:tab w:pos="9638" w:val="right" w:leader="dot"/>
+        </w:tabs>
+        <w:spacing w:after="240"/>
+      </w:pPr>
+      <w:hyperlink w:anchor="repository">
+        <w:r>
+          <w:t>5 Репозиторий с кодом</w:t>
+        </w:r>
+      </w:hyperlink>
+      <w:r>
+        <w:tab/>
+        <w:t>7</w:t>
+      </w:r>
+    </w:p>
+    <w:p>
+      <w:pPr>
+        <w:tabs>
+          <w:tab w:pos="9638" w:val="right" w:leader="dot"/>
+        </w:tabs>
+        <w:spacing w:after="240"/>
+      </w:pPr>
+      <w:hyperlink w:anchor="sources">
+        <w:r>
+          <w:t>Источники</w:t>
+        </w:r>
+      </w:hyperlink>
+      <w:r>
+        <w:tab/>
+        <w:t>7</w:t>
+      </w:r>
+    </w:p>
+    <w:p>
+      <w:r>
+        <w:br w:type="page"/>
+      </w:r>
+    </w:p>
+    <w:p>
+      <w:bookmarkStart w:id="0" w:name="goals"/>
+      <w:pPr>
+        <w:pStyle w:val="Heading1"/>
+      </w:pPr>
+      <w:r>
+        <w:t>1 Цель и задачи работы</w:t>
+      </w:r>
+      <w:bookmarkEnd w:id="0"/>
     </w:p>
     <w:p>
       <w:r>
@@ -97,25 +548,27 @@
     </w:p>
     <w:p>
       <w:r>
-        <w:t>Выполнены два проекта на основе учебной заготовки Wokwi: таймер обратного отсчета для получения варианта и калькулятор по варианту 1. Пользователь вводит данные с матричной клавиатуры; результат отображается на четырехразрядном индикаторе TM1637.</w:t>
+        <w:t>По варианту 1 разработан калькулятор для двух операндов от 0 до 9. Он выполняет сложение, вычитание, умножение и деление. Данные вводятся с матричной клавиатуры, операция выбирается клавишей *, а результат появляется на четырехразрядном индикаторе TM1637 после нажатия #.</w:t>
       </w:r>
     </w:p>
     <w:p>
       <w:r>
-        <w:t>Задачи: настроить GPIO, USART2 и SysTick; организовать опрос клавиатуры с подавлением дребезга; реализовать отсчет времени без секундных блокирующих задержек; реализовать четыре арифметические операции; обработать ошибочные действия и проверить работу в симуляторе.</w:t>
+        <w:t>Задачи работы: настроить GPIO, USART2 и SysTick; организовать опрос клавиатуры с подавлением дребезга; реализовать выбор операции и ввод операндов; выводить целый и дробный результат; обработать неполный ввод и деление на ноль; проверить работу в Wokwi.</w:t>
       </w:r>
     </w:p>
     <w:p>
+      <w:bookmarkStart w:id="1" w:name="equipment"/>
       <w:pPr>
         <w:pStyle w:val="Heading2"/>
       </w:pPr>
       <w:r>
-        <w:t>Используемое оборудование</w:t>
+        <w:t>1.1 Используемое оборудование</w:t>
       </w:r>
+      <w:bookmarkEnd w:id="1"/>
     </w:p>
     <w:p>
       <w:r>
-        <w:t>Виртуальная плата ST Nucleo C031C6, клавиатура 4×4 с подключенными первыми тремя столбцами, дисплей TM1637, светодиод и резистор 1 кОм. Клавиши A–D не подключены и не используются. Схема соединений одинакова для обоих проектов.</w:t>
+        <w:t>Использована виртуальная плата ST Nucleo C031C6, матричная клавиатура 4×4 с подключенными первыми тремя столбцами и индикатор TM1637. Клавиши A–D не подключены. Светодиод и резистор 1 кОм сохранены в схеме учебной заготовки; при работе калькулятора светодиод выключен.</w:t>
       </w:r>
     </w:p>
     <w:tbl>
@@ -277,40 +730,6 @@
           </w:tcPr>
           <w:p>
             <w:r>
-              <w:t>Светодиод</w:t>
-            </w:r>
-          </w:p>
-        </w:tc>
-        <w:tc>
-          <w:tcPr>
-            <w:tcW w:type="dxa" w:w="4819"/>
-            <w:tcBorders>
-              <w:top w:val="single" w:sz="4" w:color="D9D9D9"/>
-              <w:left w:val="single" w:sz="4" w:color="D9D9D9"/>
-              <w:bottom w:val="single" w:sz="4" w:color="D9D9D9"/>
-              <w:right w:val="single" w:sz="4" w:color="D9D9D9"/>
-            </w:tcBorders>
-          </w:tcPr>
-          <w:p>
-            <w:r>
-              <w:t>PA5 → анод; катод → резистор → GND</w:t>
-            </w:r>
-          </w:p>
-        </w:tc>
-      </w:tr>
-      <w:tr>
-        <w:tc>
-          <w:tcPr>
-            <w:tcW w:type="dxa" w:w="4819"/>
-            <w:tcBorders>
-              <w:top w:val="single" w:sz="4" w:color="D9D9D9"/>
-              <w:left w:val="single" w:sz="4" w:color="D9D9D9"/>
-              <w:bottom w:val="single" w:sz="4" w:color="D9D9D9"/>
-              <w:right w:val="single" w:sz="4" w:color="D9D9D9"/>
-            </w:tcBorders>
-          </w:tcPr>
-          <w:p>
-            <w:r>
               <w:t>USART2</w:t>
             </w:r>
           </w:p>
@@ -332,10 +751,44 @@
           </w:p>
         </w:tc>
       </w:tr>
+      <w:tr>
+        <w:tc>
+          <w:tcPr>
+            <w:tcW w:type="dxa" w:w="4819"/>
+            <w:tcBorders>
+              <w:top w:val="single" w:sz="4" w:color="D9D9D9"/>
+              <w:left w:val="single" w:sz="4" w:color="D9D9D9"/>
+              <w:bottom w:val="single" w:sz="4" w:color="D9D9D9"/>
+              <w:right w:val="single" w:sz="4" w:color="D9D9D9"/>
+            </w:tcBorders>
+          </w:tcPr>
+          <w:p>
+            <w:r>
+              <w:t>Светодиод заготовки</w:t>
+            </w:r>
+          </w:p>
+        </w:tc>
+        <w:tc>
+          <w:tcPr>
+            <w:tcW w:type="dxa" w:w="4819"/>
+            <w:tcBorders>
+              <w:top w:val="single" w:sz="4" w:color="D9D9D9"/>
+              <w:left w:val="single" w:sz="4" w:color="D9D9D9"/>
+              <w:bottom w:val="single" w:sz="4" w:color="D9D9D9"/>
+              <w:right w:val="single" w:sz="4" w:color="D9D9D9"/>
+            </w:tcBorders>
+          </w:tcPr>
+          <w:p>
+            <w:r>
+              <w:t>PA5; в калькуляторе выключен</w:t>
+            </w:r>
+          </w:p>
+        </w:tc>
+      </w:tr>
     </w:tbl>
     <w:p>
       <w:r>
-        <w:t>В проектах сохранена модель регистров и тактирования учебной заготовки. Проверки относятся к Wokwi; перенос на физическую плату требует проверки адресов регистров и настройки тактирования по документации конкретного МК.</w:t>
+        <w:t>Программа проверена в Wokwi с моделью регистров и тактирования учебной заготовки. Для переноса на физическую плату необходимо сверить адреса регистров и настройки тактирования по документации конкретного микроконтроллера.</w:t>
       </w:r>
     </w:p>
     <w:p>
@@ -344,20 +797,14 @@
       </w:r>
     </w:p>
     <w:p>
+      <w:bookmarkStart w:id="2" w:name="sequence"/>
       <w:pPr>
         <w:pStyle w:val="Heading1"/>
       </w:pPr>
       <w:r>
-        <w:t>3 Схема взаимодействия процессора и периферии</w:t>
+        <w:t>2 Схема взаимодействия процессора и периферии</w:t>
       </w:r>
-    </w:p>
-    <w:p>
-      <w:pPr>
-        <w:pStyle w:val="Heading2"/>
-      </w:pPr>
-      <w:r>
-        <w:t>Таймер обратного отсчета</w:t>
-      </w:r>
+      <w:bookmarkEnd w:id="2"/>
     </w:p>
     <w:p>
       <w:pPr>
@@ -366,64 +813,7 @@
       <w:r>
         <w:drawing>
           <wp:inline xmlns:a="http://schemas.openxmlformats.org/drawingml/2006/main" xmlns:pic="http://schemas.openxmlformats.org/drawingml/2006/picture">
-            <wp:extent cx="5897880" cy="6283133"/>
-            <wp:docPr id="1" name="Picture 1"/>
-            <wp:cNvGraphicFramePr>
-              <a:graphicFrameLocks noChangeAspect="1"/>
-            </wp:cNvGraphicFramePr>
-            <a:graphic>
-              <a:graphicData uri="http://schemas.openxmlformats.org/drawingml/2006/picture">
-                <pic:pic>
-                  <pic:nvPicPr>
-                    <pic:cNvPr id="0" name="timer.png"/>
-                    <pic:cNvPicPr/>
-                  </pic:nvPicPr>
-                  <pic:blipFill>
-                    <a:blip r:embed="rId10"/>
-                    <a:stretch>
-                      <a:fillRect/>
-                    </a:stretch>
-                  </pic:blipFill>
-                  <pic:spPr>
-                    <a:xfrm>
-                      <a:off x="0" y="0"/>
-                      <a:ext cx="5897880" cy="6283133"/>
-                    </a:xfrm>
-                    <a:prstGeom prst="rect"/>
-                  </pic:spPr>
-                </pic:pic>
-              </a:graphicData>
-            </a:graphic>
-          </wp:inline>
-        </w:drawing>
-      </w:r>
-    </w:p>
-    <w:p>
-      <w:r>
-        <w:t>Рисунок 1 — диаграмма последовательностей таймера. При запуске с нулевым значением LED включается сразу. Исходник диаграммы: diagrams/timer.puml.</w:t>
-      </w:r>
-    </w:p>
-    <w:p>
-      <w:r>
-        <w:br w:type="page"/>
-      </w:r>
-    </w:p>
-    <w:p>
-      <w:pPr>
-        <w:pStyle w:val="Heading1"/>
-      </w:pPr>
-      <w:r>
-        <w:t>Калькулятор варианта 1</w:t>
-      </w:r>
-    </w:p>
-    <w:p>
-      <w:pPr>
-        <w:jc w:val="center"/>
-      </w:pPr>
-      <w:r>
-        <w:drawing>
-          <wp:inline xmlns:a="http://schemas.openxmlformats.org/drawingml/2006/main" xmlns:pic="http://schemas.openxmlformats.org/drawingml/2006/picture">
-            <wp:extent cx="5897880" cy="6802715"/>
+            <wp:extent cx="5806440" cy="6697247"/>
             <wp:docPr id="2" name="Picture 2"/>
             <wp:cNvGraphicFramePr>
               <a:graphicFrameLocks noChangeAspect="1"/>
@@ -444,7 +834,7 @@
                   <pic:spPr>
                     <a:xfrm>
                       <a:off x="0" y="0"/>
-                      <a:ext cx="5897880" cy="6802715"/>
+                      <a:ext cx="5806440" cy="6697247"/>
                     </a:xfrm>
                     <a:prstGeom prst="rect"/>
                   </pic:spPr>
@@ -457,7 +847,7 @@
     </w:p>
     <w:p>
       <w:r>
-        <w:t>Рисунок 2 — диаграмма последовательностей калькулятора. Если выражение не введено полностью, нажатие # не запускает вычисление. Исходник диаграммы: diagrams/calculator.puml.</w:t>
+        <w:t>Рисунок 1 — диаграмма последовательностей калькулятора. Если выражение не введено полностью, клавиша # не запускает вычисление. Исходник PlantUML: diagrams/calculator.puml.</w:t>
       </w:r>
     </w:p>
     <w:p>
@@ -466,60 +856,73 @@
       </w:r>
     </w:p>
     <w:p>
+      <w:bookmarkStart w:id="3" w:name="processes"/>
       <w:pPr>
         <w:pStyle w:val="Heading1"/>
       </w:pPr>
       <w:r>
-        <w:t>4 Описание процессов на диаграммах</w:t>
+        <w:t>3 Описание процессов на диаграмме</w:t>
       </w:r>
+      <w:bookmarkEnd w:id="3"/>
     </w:p>
     <w:p>
+      <w:bookmarkStart w:id="4" w:name="init"/>
       <w:pPr>
         <w:pStyle w:val="Heading2"/>
       </w:pPr>
       <w:r>
-        <w:t>Инициализация и работа основного цикла</w:t>
+        <w:t>3.1 Инициализация и основной цикл</w:t>
+      </w:r>
+      <w:bookmarkEnd w:id="4"/>
+    </w:p>
+    <w:p>
+      <w:r>
+        <w:t>Процессор включает тактирование GPIOA, GPIOB и USART2, настраивает выводы и инициализирует дисплей. SysTick формирует прерывание каждые 1 мс при частоте 48 МГц учебного примера. Обработчик osSystickHandler только увеличивает tickCount и возвращает управление основному циклу. Переменная объявлена volatile, поскольку изменяется обработчиком прерывания и читается в main.</w:t>
       </w:r>
     </w:p>
     <w:p>
       <w:r>
-        <w:t>Процессор включает тактирование GPIOA, GPIOB и USART2, задает режимы выводов и инициализирует дисплей. SysTick настроен на прерывание каждые 1 мс в соответствии с частотой 48 МГц учебного примера. Обработчик osSystickHandler только увеличивает tickCount. Переменная объявлена volatile, поскольку изменяется обработчиком прерывания и читается в main.</w:t>
+        <w:t>Бесконечный основной цикл каждые 5 мс опрашивает клавиатуру. Для регистрации нового нажатия состояние должно сохраняться не менее 30 мс. Удержание кнопки не вызывает повторных событий; для повторного нажатия ее нужно отпустить. Индикатор обновляется только при изменении изображения.</w:t>
+      </w:r>
+    </w:p>
+    <w:p>
+      <w:bookmarkStart w:id="5" w:name="input"/>
+      <w:pPr>
+        <w:pStyle w:val="Heading2"/>
+      </w:pPr>
+      <w:r>
+        <w:t>3.2 Обработка ввода</w:t>
+      </w:r>
+      <w:bookmarkEnd w:id="5"/>
+    </w:p>
+    <w:p>
+      <w:r>
+        <w:t>Строки клавиатуры настроены как выходы с открытым стоком, столбцы — как входы с подтяжкой вверх. Процессор поочередно устанавливает низкий уровень на строке и считывает столбцы. Низкий уровень на столбце определяет нажатую клавишу. После опроса строка отпускается.</w:t>
       </w:r>
     </w:p>
     <w:p>
       <w:r>
-        <w:t>Основной цикл каждые 5 мс опрашивает матрицу: поочередно активирует строку низким уровнем и читает входы столбцов с подтяжкой вверх. После опроса строка отпускается. Для регистрации нового нажатия состояние должно сохраняться не менее 30 мс; удержание кнопки не создает повторных событий.</w:t>
+        <w:t>Первая цифра задает операнд A. Первое нажатие * выбирает сложение, последующие — вычитание, умножение и деление по циклу. Цифра после выбора операции задает B. До выбора операции новая цифра заменяет A; после выбора — заменяет B. После полученного результата или ошибки новая цифра начинает следующее выражение.</w:t>
+      </w:r>
+    </w:p>
+    <w:p>
+      <w:bookmarkStart w:id="6" w:name="result"/>
+      <w:pPr>
+        <w:pStyle w:val="Heading2"/>
+      </w:pPr>
+      <w:r>
+        <w:t>3.3 Вычисление и отображение результата</w:t>
+      </w:r>
+      <w:bookmarkEnd w:id="6"/>
+    </w:p>
+    <w:p>
+      <w:r>
+        <w:t>На клавише # проверяются наличие обоих операндов и выбранной операции, затем выполняется вычисление. Для деления сначала проверяется нулевой делитель: при B = 0 выводится Err. Дробный результат рассчитывается в сотых с округлением до ближайшего значения. Формат 01:50 означает 1,50; двоеточие индикатора разделяет целую часть и сотые.</w:t>
       </w:r>
     </w:p>
     <w:p>
       <w:r>
-        <w:t>Для вывода процессор формирует четыре маски сегментов и передает их через PA6 и PA7: команда 0x40 задает автоинкремент адреса, команда 0xC0 — начальный адрес, 0x8F — включение и максимальную яркость. Данные передаются младшим битом вперед с тактом подтверждения. Драйвер заготовки не проверяет уровень ACK. Индикатор обновляется только при изменении изображения. USART2 выводит этапы ввода и результаты проверки.</w:t>
-      </w:r>
-    </w:p>
-    <w:p>
-      <w:pPr>
-        <w:pStyle w:val="Heading2"/>
-      </w:pPr>
-      <w:r>
-        <w:t>Логика таймера</w:t>
-      </w:r>
-    </w:p>
-    <w:p>
-      <w:r>
-        <w:t>До запуска цифры накапливают длительность в секундах. Нажатие # запоминает время начала и запускает отсчет. Основной цикл вычисляет число прошедших полных секунд по разности tickCount и опорного времени. Если цикл задержался, учитываются сразу все прошедшие секунды. По достижении нуля отсчет останавливается, индикатор показывает 0, а PA5 включает LED. Нажатие * сбрасывает ввод, отсчет и сигнал завершения.</w:t>
-      </w:r>
-    </w:p>
-    <w:p>
-      <w:pPr>
-        <w:pStyle w:val="Heading2"/>
-      </w:pPr>
-      <w:r>
-        <w:t>Логика калькулятора</w:t>
-      </w:r>
-    </w:p>
-    <w:p>
-      <w:r>
-        <w:t>Первая цифра задает A. Первое нажатие * выбирает сложение, следующие — вычитание, умножение и деление по циклу. Цифра после выбора операции задает B. До нажатия # вычисление не выполняется. На # проверяется полнота ввода и нулевой делитель. При делении результат рассчитывается в сотых с округлением до ближайшего значения; формат 01:50 означает 1,50. Цифра после результата или ошибки начинает новое выражение.</w:t>
+        <w:t>Процессор формирует четыре маски сегментов и передает их через PA6 и PA7: команда 0x40 задает автоинкремент адреса, команда 0xC0 — начальный адрес, 0x8F — включение дисплея и яркость. Данные передаются младшим битом вперед с тактом подтверждения. Драйвер учебной заготовки не проверяет уровень ACK. USART2 выводит этапы ввода, выбранную операцию, результат или сообщение об ошибке.</w:t>
       </w:r>
     </w:p>
     <w:p>
@@ -528,34 +931,48 @@
       </w:r>
     </w:p>
     <w:p>
+      <w:bookmarkStart w:id="7" w:name="manual"/>
       <w:pPr>
         <w:pStyle w:val="Heading1"/>
       </w:pPr>
       <w:r>
-        <w:t>5 Руководство пользователя</w:t>
+        <w:t>4 Руководство пользователя</w:t>
       </w:r>
+      <w:bookmarkEnd w:id="7"/>
     </w:p>
     <w:p>
+      <w:bookmarkStart w:id="8" w:name="start"/>
       <w:pPr>
         <w:pStyle w:val="Heading2"/>
       </w:pPr>
       <w:r>
-        <w:t>Таймер</w:t>
+        <w:t>4.1 Запуск проекта</w:t>
+      </w:r>
+      <w:bookmarkEnd w:id="8"/>
+    </w:p>
+    <w:p>
+      <w:r>
+        <w:t>Откройте копию учебного проекта Wokwi и замените семь файлов файлами из master_class_1/variant_1 в репозитории. Запустите симуляцию. Нажимайте кнопки с удержанием более 30 мс и отпускайте между нажатиями. Для полного перезапуска используйте Restart в Wokwi.</w:t>
+      </w:r>
+    </w:p>
+    <w:p>
+      <w:bookmarkStart w:id="9" w:name="usage"/>
+      <w:pPr>
+        <w:pStyle w:val="Heading2"/>
+      </w:pPr>
+      <w:r>
+        <w:t>4.2 Ввод выражения и получение результата</w:t>
+      </w:r>
+      <w:bookmarkEnd w:id="9"/>
+    </w:p>
+    <w:p>
+      <w:r>
+        <w:t>Введите A от 0 до 9; нажмите * один, два, три или четыре раза для выбора +, −, × или ÷; введите B от 0 до 9 и нажмите #. При выборе индикатор показывает A, черту, номер операции 1–4 и B либо черту, если B еще не введен. Консоль выводит сам знак операции. При вводе B отображается B; после # — результат.</w:t>
       </w:r>
     </w:p>
     <w:p>
       <w:r>
-        <w:t>Откройте отдельную копию учебного проекта Wokwi и замените файлы файлами из папки timer. Запустите симуляцию. Введите секунды цифрами 0–9, затем нажмите #. Нажимайте кнопки с удержанием более 30 мс и отпускайте между нажатиями. Консоль показывает SET, START, LEFT и DONE.</w:t>
-      </w:r>
-    </w:p>
-    <w:p>
-      <w:r>
-        <w:t>Диапазон ввода — 0–9999 секунд. Цифра, приводящая к превышению 9999, отклоняется. Во время отсчета цифровые клавиши и # игнорируются. Клавиша * в любой момент обнуляет таймер и выключает LED. После завершения новая цифра начинает ввод следующего времени; повторное # не запускает завершенный таймер.</w:t>
-      </w:r>
-    </w:p>
-    <w:p>
-      <w:r>
-        <w:t>Проверка: ввести 1, 0 и #. На старте — 10 секунд и выключенный LED; затем индикатор уменьшается раз в секунду. На нуле LED включается и остается включенным до сброса или нового ввода.</w:t>
+        <w:t>Операцию можно изменить до вычисления. Повторное # после результата его сохраняет. Новая цифра начинает следующий расчет. Примеры: 7, *, 8, # → 15; 7, *, *, 8, # → −1; 3, *, *, *, *, 2, # → 01:50. Для 1 ÷ 3 индикатор показывает 0:33, консоль — 0.33.</w:t>
       </w:r>
     </w:p>
     <w:tbl>
@@ -595,7 +1012,7 @@
                     <a:graphicData uri="http://schemas.openxmlformats.org/drawingml/2006/picture">
                       <pic:pic>
                         <pic:nvPicPr>
-                          <pic:cNvPr id="0" name="timer-input.png"/>
+                          <pic:cNvPr id="0" name="calculator-add.png"/>
                           <pic:cNvPicPr/>
                         </pic:nvPicPr>
                         <pic:blipFill>
@@ -646,7 +1063,7 @@
                     <a:graphicData uri="http://schemas.openxmlformats.org/drawingml/2006/picture">
                       <pic:pic>
                         <pic:nvPicPr>
-                          <pic:cNvPr id="0" name="timer-done.png"/>
+                          <pic:cNvPr id="0" name="calculator-divide.png"/>
                           <pic:cNvPicPr/>
                         </pic:nvPicPr>
                         <pic:blipFill>
@@ -675,7 +1092,7 @@
     </w:tbl>
     <w:p>
       <w:r>
-        <w:t>Рисунки 3 и 4 — ввод 10 секунд и завершение отсчета. Скриншоты получены из работающего Wokwi. Справа в консоли видны LEFT и DONE: LED ON.</w:t>
+        <w:t>Рисунки 2 и 3 — результаты 7 + 8 = 15 и 3 ÷ 2 = 1,50. Скриншоты получены из работающего Wokwi; в консоли видны операнды, выбранная операция и RESULT.</w:t>
       </w:r>
     </w:p>
     <w:p>
@@ -684,32 +1101,14 @@
       </w:r>
     </w:p>
     <w:p>
+      <w:bookmarkStart w:id="10" w:name="checks"/>
       <w:pPr>
-        <w:pStyle w:val="Heading1"/>
+        <w:pStyle w:val="Heading2"/>
       </w:pPr>
       <w:r>
-        <w:t>Калькулятор</w:t>
+        <w:t>4.3 Проверка основных функций</w:t>
       </w:r>
-    </w:p>
-    <w:p>
-      <w:r>
-        <w:t>Откройте другую копию учебного проекта и замените файлы файлами из папки calculator. Введите A от 0 до 9; нажмите * один, два, три или четыре раза для выбора +, −, × или ÷; введите B от 0 до 9 и нажмите #.</w:t>
-      </w:r>
-    </w:p>
-    <w:p>
-      <w:r>
-        <w:t>При выборе операции индикатор показывает A, знак разделения, номер операции и B. Номера: 1 — сложение; 2 — вычитание; 3 — умножение; 4 — деление. Консоль выводит сам знак операции. Если B еще не введен, крайний разряд содержит черту. После ввода B виден операнд, после # — результат.</w:t>
-      </w:r>
-    </w:p>
-    <w:p>
-      <w:r>
-        <w:t>До выбора операции новая цифра заменяет A; после выбора — заменяет B. Операцию можно изменить до вычисления. Повторное # после результата его сохраняет. Для следующего выражения нажмите цифру; для полного перезапуска используйте кнопку Restart в Wokwi.</w:t>
-      </w:r>
-    </w:p>
-    <w:p>
-      <w:r>
-        <w:t>Примеры: 7, *, 8, # → 15; 7, *, *, 8, # → −1; 9, *, *, *, 9, # → 81; 3, *, *, *, *, 2, # → 01:50. Двоеточие разделяет целую часть и сотые, а не часы и минуты. Для 1 ÷ 3 отображается 0:33, в консоли — 0.33.</w:t>
-      </w:r>
+      <w:bookmarkEnd w:id="10"/>
     </w:p>
     <w:tbl>
       <w:tblPr>
@@ -748,7 +1147,7 @@
                     <a:graphicData uri="http://schemas.openxmlformats.org/drawingml/2006/picture">
                       <pic:pic>
                         <pic:nvPicPr>
-                          <pic:cNvPr id="0" name="calculator-add.png"/>
+                          <pic:cNvPr id="0" name="calculator-multiply.png"/>
                           <pic:cNvPicPr/>
                         </pic:nvPicPr>
                         <pic:blipFill>
@@ -799,7 +1198,7 @@
                     <a:graphicData uri="http://schemas.openxmlformats.org/drawingml/2006/picture">
                       <pic:pic>
                         <pic:nvPicPr>
-                          <pic:cNvPr id="0" name="calculator-divide.png"/>
+                          <pic:cNvPr id="0" name="calculator-error.png"/>
                           <pic:cNvPicPr/>
                         </pic:nvPicPr>
                         <pic:blipFill>
@@ -828,160 +1227,29 @@
     </w:tbl>
     <w:p>
       <w:r>
-        <w:t>Рисунки 5 и 6 — результаты 7 + 8 = 15 и 3 ÷ 2 = 1,50. В консоли отображаются операнды, выбранная операция и RESULT.</w:t>
+        <w:t>Рисунки 4 и 5 — результат 9 × 9 = 81 и Err при 9 ÷ 0. После ошибки ввод новой цифры начинает следующее выражение.</w:t>
       </w:r>
     </w:p>
     <w:p>
       <w:r>
-        <w:br w:type="page"/>
+        <w:t>В Wokwi также подтверждено отрицательное значение 7 − 8 = −1. Тесты логики на компьютере охватили 400 сочетаний двух операндов и четырех операций, неполный ввод и начало следующего выражения. Они завершились успешно. Испытания физической платы не проводились.</w:t>
       </w:r>
     </w:p>
     <w:p>
+      <w:bookmarkStart w:id="11" w:name="repository"/>
       <w:pPr>
         <w:pStyle w:val="Heading1"/>
       </w:pPr>
       <w:r>
-        <w:t>Проверка основных функций</w:t>
+        <w:t>5 Репозиторий с кодом</w:t>
       </w:r>
-    </w:p>
-    <w:tbl>
-      <w:tblPr>
-        <w:tblW w:type="auto" w:w="0"/>
-        <w:tblLayout w:type="fixed"/>
-        <w:tblLook w:firstColumn="1" w:firstRow="1" w:lastColumn="0" w:lastRow="0" w:noHBand="0" w:noVBand="1" w:val="04A0"/>
-      </w:tblPr>
-      <w:tblGrid>
-        <w:gridCol w:w="4819"/>
-        <w:gridCol w:w="4819"/>
-      </w:tblGrid>
-      <w:tr>
-        <w:tc>
-          <w:tcPr>
-            <w:tcW w:type="dxa" w:w="4677"/>
-            <w:tcBorders>
-              <w:top w:val="single" w:sz="4" w:color="D9D9D9"/>
-              <w:left w:val="single" w:sz="4" w:color="D9D9D9"/>
-              <w:bottom w:val="single" w:sz="4" w:color="D9D9D9"/>
-              <w:right w:val="single" w:sz="4" w:color="D9D9D9"/>
-            </w:tcBorders>
-          </w:tcPr>
-          <w:p>
-            <w:pPr>
-              <w:jc w:val="center"/>
-            </w:pPr>
-            <w:r>
-              <w:drawing>
-                <wp:inline xmlns:a="http://schemas.openxmlformats.org/drawingml/2006/main" xmlns:pic="http://schemas.openxmlformats.org/drawingml/2006/picture">
-                  <wp:extent cx="2697480" cy="3685032"/>
-                  <wp:docPr id="7" name="Picture 7"/>
-                  <wp:cNvGraphicFramePr>
-                    <a:graphicFrameLocks noChangeAspect="1"/>
-                  </wp:cNvGraphicFramePr>
-                  <a:graphic>
-                    <a:graphicData uri="http://schemas.openxmlformats.org/drawingml/2006/picture">
-                      <pic:pic>
-                        <pic:nvPicPr>
-                          <pic:cNvPr id="0" name="calculator-multiply.png"/>
-                          <pic:cNvPicPr/>
-                        </pic:nvPicPr>
-                        <pic:blipFill>
-                          <a:blip r:embed="rId16"/>
-                          <a:srcRect l="16552"/>
-                          <a:stretch>
-                            <a:fillRect/>
-                          </a:stretch>
-                        </pic:blipFill>
-                        <pic:spPr>
-                          <a:xfrm>
-                            <a:off x="0" y="0"/>
-                            <a:ext cx="2697480" cy="3685032"/>
-                          </a:xfrm>
-                          <a:prstGeom prst="rect"/>
-                        </pic:spPr>
-                      </pic:pic>
-                    </a:graphicData>
-                  </a:graphic>
-                </wp:inline>
-              </w:drawing>
-            </w:r>
-          </w:p>
-        </w:tc>
-        <w:tc>
-          <w:tcPr>
-            <w:tcW w:type="dxa" w:w="4677"/>
-            <w:tcBorders>
-              <w:top w:val="single" w:sz="4" w:color="D9D9D9"/>
-              <w:left w:val="single" w:sz="4" w:color="D9D9D9"/>
-              <w:bottom w:val="single" w:sz="4" w:color="D9D9D9"/>
-              <w:right w:val="single" w:sz="4" w:color="D9D9D9"/>
-            </w:tcBorders>
-          </w:tcPr>
-          <w:p>
-            <w:pPr>
-              <w:jc w:val="center"/>
-            </w:pPr>
-            <w:r>
-              <w:drawing>
-                <wp:inline xmlns:a="http://schemas.openxmlformats.org/drawingml/2006/main" xmlns:pic="http://schemas.openxmlformats.org/drawingml/2006/picture">
-                  <wp:extent cx="2697480" cy="3685032"/>
-                  <wp:docPr id="8" name="Picture 8"/>
-                  <wp:cNvGraphicFramePr>
-                    <a:graphicFrameLocks noChangeAspect="1"/>
-                  </wp:cNvGraphicFramePr>
-                  <a:graphic>
-                    <a:graphicData uri="http://schemas.openxmlformats.org/drawingml/2006/picture">
-                      <pic:pic>
-                        <pic:nvPicPr>
-                          <pic:cNvPr id="0" name="calculator-error.png"/>
-                          <pic:cNvPicPr/>
-                        </pic:nvPicPr>
-                        <pic:blipFill>
-                          <a:blip r:embed="rId17"/>
-                          <a:srcRect l="16552"/>
-                          <a:stretch>
-                            <a:fillRect/>
-                          </a:stretch>
-                        </pic:blipFill>
-                        <pic:spPr>
-                          <a:xfrm>
-                            <a:off x="0" y="0"/>
-                            <a:ext cx="2697480" cy="3685032"/>
-                          </a:xfrm>
-                          <a:prstGeom prst="rect"/>
-                        </pic:spPr>
-                      </pic:pic>
-                    </a:graphicData>
-                  </a:graphic>
-                </wp:inline>
-              </w:drawing>
-            </w:r>
-          </w:p>
-        </w:tc>
-      </w:tr>
-    </w:tbl>
-    <w:p>
-      <w:r>
-        <w:t>Рисунки 7 и 8 — результат 9 × 9 = 81 и Err при 9 ÷ 0. После ошибки ввод новой цифры позволяет начать следующее выражение.</w:t>
-      </w:r>
-    </w:p>
-    <w:p>
-      <w:r>
-        <w:t>В Wokwi также проверено отрицательное значение 7 − 8 = −1 и выключение LED после сброса таймера. Проверка логики на компьютере охватила 400 сочетаний двух операндов и четырех операций, неполный ввод и начало следующего выражения. Для таймера проверены граница одной секунды, запоздалый опрос, нулевой ввод, предел 9999, переполнение счетчика времени и сброс во время отсчета. Эти проверки не заменяют испытания физической платы.</w:t>
-      </w:r>
-    </w:p>
-    <w:p>
-      <w:pPr>
-        <w:pStyle w:val="Heading1"/>
-      </w:pPr>
-      <w:r>
-        <w:t>6 Репозиторий с кодом</w:t>
-      </w:r>
+      <w:bookmarkEnd w:id="11"/>
     </w:p>
     <w:p>
       <w:r>
         <w:t xml:space="preserve">Ссылка на репозиторий: </w:t>
       </w:r>
-      <w:hyperlink r:id="rId18">
+      <w:hyperlink r:id="rId16">
         <w:r>
           <w:t>https://github.com/Deformater/embedded_systems</w:t>
         </w:r>
@@ -989,25 +1257,27 @@
     </w:p>
     <w:p>
       <w:r>
-        <w:t>Исходные тексты программ приведены в отдельных файлах проекта и не включены в отчет. Для воспроизведения используются main.c, main.h, keyboard.c, keyboard.h, tm1637.c, tm1637.h и diagram.json в каждой папке.</w:t>
+        <w:t>Код калькулятора находится в master_class_1/variant_1. Для запуска используются main.c, main.h, keyboard.c, keyboard.h, tm1637.c, tm1637.h и diagram.json. Листинги кода в отчет не включены.</w:t>
       </w:r>
     </w:p>
     <w:p>
+      <w:bookmarkStart w:id="12" w:name="sources"/>
       <w:pPr>
         <w:pStyle w:val="Heading2"/>
       </w:pPr>
       <w:r>
         <w:t>Источники</w:t>
       </w:r>
+      <w:bookmarkEnd w:id="12"/>
     </w:p>
     <w:p>
       <w:r>
-        <w:t>Задание: МК1 2026.pdf, слайды 20–21. Учебный проект: https://wokwi.com/projects/441248357913176065</w:t>
+        <w:t>Задание: МК1 2026.pdf, слайд 21. Учебный проект: https://wokwi.com/projects/441248357913176065</w:t>
       </w:r>
     </w:p>
     <w:p>
       <w:r>
-        <w:t>Синтаксис диаграмм: https://plantuml.com/ru/sequence-diagram</w:t>
+        <w:t>PlantUML: https://plantuml.com/ru/sequence-diagram</w:t>
       </w:r>
     </w:p>
     <w:p>
@@ -1469,7 +1739,7 @@
       <w:outlineLvl w:val="0"/>
     </w:pPr>
     <w:rPr>
-      <w:rFonts w:asciiTheme="majorHAnsi" w:eastAsiaTheme="majorEastAsia" w:hAnsiTheme="majorHAnsi" w:cstheme="majorBidi" w:ascii="Times New Roman" w:hAnsi="Times New Roman"/>
+      <w:rFonts w:cstheme="majorBidi" w:ascii="Times New Roman" w:hAnsi="Times New Roman"/>
       <w:b/>
       <w:bCs/>
       <w:color w:val="000000"/>
@@ -1493,7 +1763,7 @@
       <w:outlineLvl w:val="1"/>
     </w:pPr>
     <w:rPr>
-      <w:rFonts w:asciiTheme="majorHAnsi" w:eastAsiaTheme="majorEastAsia" w:hAnsiTheme="majorHAnsi" w:cstheme="majorBidi" w:ascii="Times New Roman" w:hAnsi="Times New Roman"/>
+      <w:rFonts w:cstheme="majorBidi" w:ascii="Times New Roman" w:hAnsi="Times New Roman"/>
       <w:b/>
       <w:bCs/>
       <w:color w:val="000000"/>
@@ -1755,11 +2025,11 @@
       <w:contextualSpacing/>
     </w:pPr>
     <w:rPr>
-      <w:rFonts w:asciiTheme="majorHAnsi" w:eastAsiaTheme="majorEastAsia" w:hAnsiTheme="majorHAnsi" w:cstheme="majorBidi" w:ascii="Times New Roman" w:hAnsi="Times New Roman"/>
+      <w:rFonts w:cstheme="majorBidi" w:ascii="Times New Roman" w:hAnsi="Times New Roman"/>
       <w:color w:val="000000"/>
       <w:spacing w:val="5"/>
       <w:kern w:val="28"/>
-      <w:sz w:val="32"/>
+      <w:sz w:val="28"/>
       <w:szCs w:val="52"/>
     </w:rPr>
   </w:style>

</xml_diff>

<commit_message>
Remove submission date, defense date and score from report cover
</commit_message>
<xml_diff>
--- a/master_class_1/variant_1/report/Отчет_МК1_вариант_1.docx
+++ b/master_class_1/variant_1/report/Отчет_МК1_вариант_1.docx
@@ -184,7 +184,7 @@
     </w:p>
     <w:p>
       <w:pPr>
-        <w:spacing w:before="0" w:after="400" w:line="240" w:lineRule="auto"/>
+        <w:spacing w:before="0" w:after="3280" w:line="240" w:lineRule="auto"/>
         <w:jc w:val="left"/>
       </w:pPr>
       <w:r>
@@ -203,72 +203,6 @@
           <w:sz w:val="36"/>
         </w:rPr>
         <w:t>Быковский Сергей Вячеславович</w:t>
-      </w:r>
-    </w:p>
-    <w:p>
-      <w:pPr>
-        <w:spacing w:before="0" w:after="400" w:line="240" w:lineRule="auto"/>
-        <w:jc w:val="left"/>
-      </w:pPr>
-      <w:r>
-        <w:rPr>
-          <w:rFonts w:ascii="Times New Roman" w:hAnsi="Times New Roman"/>
-          <w:b w:val="0"/>
-          <w:sz w:val="36"/>
-        </w:rPr>
-        <w:t xml:space="preserve">Дата сдачи отчета: </w:t>
-      </w:r>
-      <w:r>
-        <w:rPr>
-          <w:rFonts w:ascii="Times New Roman" w:hAnsi="Times New Roman"/>
-          <w:b w:val="0"/>
-          <w:i w:val="0"/>
-          <w:sz w:val="36"/>
-        </w:rPr>
-      </w:r>
-    </w:p>
-    <w:p>
-      <w:pPr>
-        <w:spacing w:before="0" w:after="560" w:line="240" w:lineRule="auto"/>
-        <w:jc w:val="left"/>
-      </w:pPr>
-      <w:r>
-        <w:rPr>
-          <w:rFonts w:ascii="Times New Roman" w:hAnsi="Times New Roman"/>
-          <w:b w:val="0"/>
-          <w:sz w:val="36"/>
-        </w:rPr>
-        <w:t xml:space="preserve">Дата защиты: </w:t>
-      </w:r>
-      <w:r>
-        <w:rPr>
-          <w:rFonts w:ascii="Times New Roman" w:hAnsi="Times New Roman"/>
-          <w:b w:val="0"/>
-          <w:i w:val="0"/>
-          <w:sz w:val="36"/>
-        </w:rPr>
-      </w:r>
-    </w:p>
-    <w:p>
-      <w:pPr>
-        <w:spacing w:before="0" w:after="840" w:line="240" w:lineRule="auto"/>
-        <w:jc w:val="left"/>
-      </w:pPr>
-      <w:r>
-        <w:rPr>
-          <w:rFonts w:ascii="Times New Roman" w:hAnsi="Times New Roman"/>
-          <w:b w:val="0"/>
-          <w:sz w:val="36"/>
-        </w:rPr>
-        <w:t xml:space="preserve">Количество баллов: </w:t>
-      </w:r>
-      <w:r>
-        <w:rPr>
-          <w:rFonts w:ascii="Times New Roman" w:hAnsi="Times New Roman"/>
-          <w:b w:val="0"/>
-          <w:i w:val="0"/>
-          <w:sz w:val="36"/>
-        </w:rPr>
       </w:r>
     </w:p>
     <w:p>

</xml_diff>